<commit_message>
Deploy preview for PR 633 🛫
</commit_message>
<xml_diff>
--- a/pr-preview/pr-633/vignettes/articles/version-crosswalk-1.3-to-1.4.docx
+++ b/pr-preview/pr-633/vignettes/articles/version-crosswalk-1.3-to-1.4.docx
@@ -3067,7 +3067,7 @@
         <w:rPr>
           <w:rStyle w:val="CommentTok"/>
         </w:rPr>
-        <w:t xml:space="preserve">#&gt; 1  6.56 1     HlyE_IgA    0.600</w:t>
+        <w:t xml:space="preserve">#&gt; 1 14.0  1     HlyE_IgA    1.44 </w:t>
       </w:r>
       <w:r>
         <w:br/>
@@ -3076,7 +3076,7 @@
         <w:rPr>
           <w:rStyle w:val="CommentTok"/>
         </w:rPr>
-        <w:t xml:space="preserve">#&gt; 2  6.56 1     HlyE_IgG    2.79 </w:t>
+        <w:t xml:space="preserve">#&gt; 2 14.0  1     HlyE_IgG    9.63 </w:t>
       </w:r>
       <w:r>
         <w:br/>
@@ -3085,7 +3085,7 @@
         <w:rPr>
           <w:rStyle w:val="CommentTok"/>
         </w:rPr>
-        <w:t xml:space="preserve">#&gt; 3 14.1  2     HlyE_IgA    1.08 </w:t>
+        <w:t xml:space="preserve">#&gt; 3  5.22 2     HlyE_IgA    0.817</w:t>
       </w:r>
       <w:r>
         <w:br/>
@@ -3094,7 +3094,7 @@
         <w:rPr>
           <w:rStyle w:val="CommentTok"/>
         </w:rPr>
-        <w:t xml:space="preserve">#&gt; 4 14.1  2     HlyE_IgG    0.559</w:t>
+        <w:t xml:space="preserve">#&gt; 4  5.22 2     HlyE_IgG    0.399</w:t>
       </w:r>
       <w:r>
         <w:br/>
@@ -3103,7 +3103,7 @@
         <w:rPr>
           <w:rStyle w:val="CommentTok"/>
         </w:rPr>
-        <w:t xml:space="preserve">#&gt; 5  9.75 3     HlyE_IgA    0.375</w:t>
+        <w:t xml:space="preserve">#&gt; 5 15.6  3     HlyE_IgA    0.797</w:t>
       </w:r>
       <w:r>
         <w:br/>
@@ -3112,7 +3112,7 @@
         <w:rPr>
           <w:rStyle w:val="CommentTok"/>
         </w:rPr>
-        <w:t xml:space="preserve">#&gt; 6  9.75 3     HlyE_IgG    0.420</w:t>
+        <w:t xml:space="preserve">#&gt; 6 15.6  3     HlyE_IgG    0.604</w:t>
       </w:r>
       <w:r>
         <w:br/>

</xml_diff>